<commit_message>
Added normal distribution codes
</commit_message>
<xml_diff>
--- a/LabExercises-Sem1/2025166043-DSLaboratory.docx
+++ b/LabExercises-Sem1/2025166043-DSLaboratory.docx
@@ -78,26 +78,16 @@
               <w:t xml:space="preserve"> = </w:t>
             </w:r>
             <w:proofErr w:type="spellStart"/>
-            <w:proofErr w:type="gramStart"/>
-            <w:r>
-              <w:t>os.path</w:t>
-            </w:r>
-            <w:proofErr w:type="gramEnd"/>
-            <w:r>
-              <w:t>.dirname</w:t>
+            <w:r>
+              <w:t>os.path.dirname</w:t>
             </w:r>
             <w:proofErr w:type="spellEnd"/>
             <w:r>
               <w:t>(</w:t>
             </w:r>
             <w:proofErr w:type="spellStart"/>
-            <w:proofErr w:type="gramStart"/>
-            <w:r>
-              <w:t>os.path</w:t>
-            </w:r>
-            <w:proofErr w:type="gramEnd"/>
-            <w:r>
-              <w:t>.abspath</w:t>
+            <w:r>
+              <w:t>os.path.abspath</w:t>
             </w:r>
             <w:proofErr w:type="spellEnd"/>
             <w:r>
@@ -114,24 +104,14 @@
               <w:t xml:space="preserve"> = </w:t>
             </w:r>
             <w:proofErr w:type="spellStart"/>
-            <w:proofErr w:type="gramStart"/>
-            <w:r>
-              <w:t>os.path</w:t>
-            </w:r>
-            <w:proofErr w:type="gramEnd"/>
-            <w:r>
-              <w:t>.</w:t>
-            </w:r>
-            <w:proofErr w:type="gramStart"/>
-            <w:r>
-              <w:t>join</w:t>
+            <w:r>
+              <w:t>os.path.join</w:t>
             </w:r>
             <w:proofErr w:type="spellEnd"/>
             <w:r>
               <w:t>(</w:t>
             </w:r>
             <w:proofErr w:type="spellStart"/>
-            <w:proofErr w:type="gramEnd"/>
             <w:r>
               <w:t>base_dir</w:t>
             </w:r>
@@ -151,13 +131,8 @@
               <w:t xml:space="preserve"> = </w:t>
             </w:r>
             <w:proofErr w:type="spellStart"/>
-            <w:proofErr w:type="gramStart"/>
-            <w:r>
-              <w:t>pd.read</w:t>
-            </w:r>
-            <w:proofErr w:type="gramEnd"/>
-            <w:r>
-              <w:t>_csv</w:t>
+            <w:r>
+              <w:t>pd.read_csv</w:t>
             </w:r>
             <w:proofErr w:type="spellEnd"/>
             <w:r>
@@ -177,12 +152,10 @@
               <w:t>print(</w:t>
             </w:r>
             <w:proofErr w:type="spellStart"/>
-            <w:proofErr w:type="gramStart"/>
             <w:r>
               <w:t>df.head</w:t>
             </w:r>
             <w:proofErr w:type="spellEnd"/>
-            <w:proofErr w:type="gramEnd"/>
             <w:r>
               <w:t>())</w:t>
             </w:r>
@@ -200,15 +173,7 @@
           </w:p>
           <w:p>
             <w:r>
-              <w:t xml:space="preserve">with </w:t>
-            </w:r>
-            <w:proofErr w:type="gramStart"/>
-            <w:r>
-              <w:t>open(</w:t>
-            </w:r>
-            <w:proofErr w:type="gramEnd"/>
-            <w:r>
-              <w:t>"output/output.txt", "w") as f:</w:t>
+              <w:t>with open("output/output.txt", "w") as f:</w:t>
             </w:r>
           </w:p>
           <w:p>
@@ -216,12 +181,10 @@
               <w:t xml:space="preserve">    </w:t>
             </w:r>
             <w:proofErr w:type="spellStart"/>
-            <w:proofErr w:type="gramStart"/>
             <w:r>
               <w:t>f.write</w:t>
             </w:r>
             <w:proofErr w:type="spellEnd"/>
-            <w:proofErr w:type="gramEnd"/>
             <w:r>
               <w:t>("Hello World\n")</w:t>
             </w:r>
@@ -231,40 +194,28 @@
               <w:t xml:space="preserve">    </w:t>
             </w:r>
             <w:proofErr w:type="spellStart"/>
-            <w:proofErr w:type="gramStart"/>
             <w:r>
               <w:t>f.write</w:t>
             </w:r>
             <w:proofErr w:type="spellEnd"/>
-            <w:proofErr w:type="gramEnd"/>
             <w:r>
               <w:t>(</w:t>
             </w:r>
             <w:proofErr w:type="spellStart"/>
-            <w:proofErr w:type="gramStart"/>
             <w:r>
               <w:t>df.head</w:t>
             </w:r>
             <w:proofErr w:type="spellEnd"/>
-            <w:proofErr w:type="gramEnd"/>
             <w:r>
               <w:t>().</w:t>
             </w:r>
             <w:proofErr w:type="spellStart"/>
             <w:r>
-              <w:t>to_</w:t>
-            </w:r>
-            <w:proofErr w:type="gramStart"/>
-            <w:r>
-              <w:t>string</w:t>
-            </w:r>
-            <w:proofErr w:type="spellEnd"/>
-            <w:r>
-              <w:t>(</w:t>
-            </w:r>
-            <w:proofErr w:type="gramEnd"/>
-            <w:r>
-              <w:t>))</w:t>
+              <w:t>to_string</w:t>
+            </w:r>
+            <w:proofErr w:type="spellEnd"/>
+            <w:r>
+              <w:t>())</w:t>
             </w:r>
           </w:p>
           <w:p/>
@@ -395,258 +346,158 @@
           </w:p>
           <w:p/>
           <w:p>
-            <w:proofErr w:type="gramStart"/>
+            <w:r>
+              <w:t>print("Mean: " + str(</w:t>
+            </w:r>
+            <w:proofErr w:type="spellStart"/>
+            <w:r>
+              <w:t>np.mean</w:t>
+            </w:r>
+            <w:proofErr w:type="spellEnd"/>
+            <w:r>
+              <w:t>(ages)))  # Mean</w:t>
+            </w:r>
+          </w:p>
+          <w:p>
+            <w:r>
+              <w:t>print("Median: " + str(</w:t>
+            </w:r>
+            <w:proofErr w:type="spellStart"/>
+            <w:r>
+              <w:t>np.median</w:t>
+            </w:r>
+            <w:proofErr w:type="spellEnd"/>
+            <w:r>
+              <w:t>(ages)))  # Median</w:t>
+            </w:r>
+          </w:p>
+          <w:p>
+            <w:r>
+              <w:t>print("</w:t>
+            </w:r>
+            <w:proofErr w:type="spellStart"/>
+            <w:r>
+              <w:t>StandardDeviation</w:t>
+            </w:r>
+            <w:proofErr w:type="spellEnd"/>
+            <w:r>
+              <w:t>: " + str(</w:t>
+            </w:r>
+            <w:proofErr w:type="spellStart"/>
+            <w:r>
+              <w:t>np.std</w:t>
+            </w:r>
+            <w:proofErr w:type="spellEnd"/>
+            <w:r>
+              <w:t>(ages)))  # Standard Deviation</w:t>
+            </w:r>
+          </w:p>
+          <w:p>
+            <w:r>
+              <w:t>print("Variance: " + str(</w:t>
+            </w:r>
+            <w:proofErr w:type="spellStart"/>
+            <w:r>
+              <w:t>np.var</w:t>
+            </w:r>
+            <w:proofErr w:type="spellEnd"/>
+            <w:r>
+              <w:t>(ages)))  # Variance</w:t>
+            </w:r>
+          </w:p>
+          <w:p>
+            <w:proofErr w:type="spellStart"/>
+            <w:r>
+              <w:t>df</w:t>
+            </w:r>
+            <w:proofErr w:type="spellEnd"/>
+            <w:r>
+              <w:t xml:space="preserve">  = </w:t>
+            </w:r>
+            <w:proofErr w:type="spellStart"/>
+            <w:r>
+              <w:t>pd.DataFrame</w:t>
+            </w:r>
+            <w:proofErr w:type="spellEnd"/>
+            <w:r>
+              <w:t>(ages, columns=['ages'])</w:t>
+            </w:r>
+          </w:p>
+          <w:p>
+            <w:r>
+              <w:t>print("Mode: " + str(</w:t>
+            </w:r>
+            <w:proofErr w:type="spellStart"/>
+            <w:r>
+              <w:t>df.ages.mode</w:t>
+            </w:r>
+            <w:proofErr w:type="spellEnd"/>
+            <w:r>
+              <w:t>()))  # Mode</w:t>
+            </w:r>
+          </w:p>
+          <w:p/>
+          <w:p>
+            <w:r>
+              <w:t xml:space="preserve">q1 = </w:t>
+            </w:r>
+            <w:proofErr w:type="spellStart"/>
+            <w:r>
+              <w:t>np.percentile</w:t>
+            </w:r>
+            <w:proofErr w:type="spellEnd"/>
+            <w:r>
+              <w:t>(ages, 25)</w:t>
+            </w:r>
+          </w:p>
+          <w:p>
+            <w:r>
+              <w:t xml:space="preserve">q3 = </w:t>
+            </w:r>
+            <w:proofErr w:type="spellStart"/>
+            <w:r>
+              <w:t>np.percentile</w:t>
+            </w:r>
+            <w:proofErr w:type="spellEnd"/>
+            <w:r>
+              <w:t>(ages, 75)</w:t>
+            </w:r>
+          </w:p>
+          <w:p/>
+          <w:p>
+            <w:proofErr w:type="spellStart"/>
+            <w:r>
+              <w:t>iqr</w:t>
+            </w:r>
+            <w:proofErr w:type="spellEnd"/>
+            <w:r>
+              <w:t xml:space="preserve"> = q3 - q1</w:t>
+            </w:r>
+          </w:p>
+          <w:p>
             <w:r>
               <w:t>print(</w:t>
             </w:r>
-            <w:proofErr w:type="gramEnd"/>
-            <w:r>
-              <w:t>"Mean: " + str(</w:t>
-            </w:r>
-            <w:proofErr w:type="spellStart"/>
-            <w:proofErr w:type="gramStart"/>
-            <w:r>
-              <w:t>np.mean</w:t>
-            </w:r>
-            <w:proofErr w:type="spellEnd"/>
-            <w:proofErr w:type="gramEnd"/>
-            <w:r>
-              <w:t>(ages)</w:t>
-            </w:r>
-            <w:proofErr w:type="gramStart"/>
-            <w:r>
-              <w:t>))  #</w:t>
-            </w:r>
-            <w:proofErr w:type="gramEnd"/>
-            <w:r>
-              <w:t xml:space="preserve"> Mean</w:t>
-            </w:r>
-          </w:p>
-          <w:p>
-            <w:proofErr w:type="gramStart"/>
-            <w:r>
-              <w:t>print(</w:t>
-            </w:r>
-            <w:proofErr w:type="gramEnd"/>
-            <w:r>
-              <w:t>"Median: " + str(</w:t>
-            </w:r>
-            <w:proofErr w:type="spellStart"/>
-            <w:proofErr w:type="gramStart"/>
-            <w:r>
-              <w:t>np.median</w:t>
-            </w:r>
-            <w:proofErr w:type="spellEnd"/>
-            <w:proofErr w:type="gramEnd"/>
-            <w:r>
-              <w:t>(ages)</w:t>
-            </w:r>
-            <w:proofErr w:type="gramStart"/>
-            <w:r>
-              <w:t>))  #</w:t>
-            </w:r>
-            <w:proofErr w:type="gramEnd"/>
-            <w:r>
-              <w:t xml:space="preserve"> Median</w:t>
-            </w:r>
-          </w:p>
-          <w:p>
-            <w:proofErr w:type="gramStart"/>
-            <w:r>
-              <w:t>print(</w:t>
-            </w:r>
-            <w:proofErr w:type="gramEnd"/>
-            <w:r>
-              <w:t>"</w:t>
-            </w:r>
-            <w:proofErr w:type="spellStart"/>
-            <w:r>
-              <w:t>StandardDeviation</w:t>
-            </w:r>
-            <w:proofErr w:type="spellEnd"/>
-            <w:r>
-              <w:t>: " + str(</w:t>
-            </w:r>
-            <w:proofErr w:type="spellStart"/>
-            <w:r>
-              <w:t>np.std</w:t>
-            </w:r>
-            <w:proofErr w:type="spellEnd"/>
-            <w:r>
-              <w:t>(ages)</w:t>
-            </w:r>
-            <w:proofErr w:type="gramStart"/>
-            <w:r>
-              <w:t>))  #</w:t>
-            </w:r>
-            <w:proofErr w:type="gramEnd"/>
-            <w:r>
-              <w:t xml:space="preserve"> Standard Deviation</w:t>
-            </w:r>
-          </w:p>
-          <w:p>
-            <w:proofErr w:type="gramStart"/>
-            <w:r>
-              <w:t>print(</w:t>
-            </w:r>
-            <w:proofErr w:type="gramEnd"/>
-            <w:r>
-              <w:t>"Variance: " + str(</w:t>
-            </w:r>
-            <w:proofErr w:type="spellStart"/>
-            <w:r>
-              <w:t>np.var</w:t>
-            </w:r>
-            <w:proofErr w:type="spellEnd"/>
-            <w:r>
-              <w:t>(ages)</w:t>
-            </w:r>
-            <w:proofErr w:type="gramStart"/>
-            <w:r>
-              <w:t>))  #</w:t>
-            </w:r>
-            <w:proofErr w:type="gramEnd"/>
-            <w:r>
-              <w:t xml:space="preserve"> Variance</w:t>
-            </w:r>
-          </w:p>
-          <w:p>
-            <w:proofErr w:type="spellStart"/>
-            <w:proofErr w:type="gramStart"/>
-            <w:r>
-              <w:t>df</w:t>
-            </w:r>
-            <w:proofErr w:type="spellEnd"/>
-            <w:r>
-              <w:t xml:space="preserve">  =</w:t>
-            </w:r>
-            <w:proofErr w:type="gramEnd"/>
-            <w:r>
-              <w:t xml:space="preserve"> </w:t>
-            </w:r>
-            <w:proofErr w:type="spellStart"/>
-            <w:proofErr w:type="gramStart"/>
-            <w:r>
-              <w:t>pd.DataFrame</w:t>
-            </w:r>
-            <w:proofErr w:type="spellEnd"/>
-            <w:proofErr w:type="gramEnd"/>
-            <w:r>
-              <w:t>(ages, columns=['ages'])</w:t>
-            </w:r>
-          </w:p>
-          <w:p>
-            <w:proofErr w:type="gramStart"/>
-            <w:r>
-              <w:t>print(</w:t>
-            </w:r>
-            <w:proofErr w:type="gramEnd"/>
-            <w:r>
-              <w:t>"Mode: " + str(</w:t>
-            </w:r>
-            <w:proofErr w:type="spellStart"/>
-            <w:proofErr w:type="gramStart"/>
-            <w:r>
-              <w:t>df.ages</w:t>
-            </w:r>
-            <w:proofErr w:type="gramEnd"/>
-            <w:r>
-              <w:t>.</w:t>
-            </w:r>
-            <w:proofErr w:type="gramStart"/>
-            <w:r>
-              <w:t>mode</w:t>
-            </w:r>
-            <w:proofErr w:type="spellEnd"/>
-            <w:r>
-              <w:t>(</w:t>
-            </w:r>
-            <w:proofErr w:type="gramEnd"/>
-            <w:r>
-              <w:t>)</w:t>
-            </w:r>
-            <w:proofErr w:type="gramStart"/>
-            <w:r>
-              <w:t>))  #</w:t>
-            </w:r>
-            <w:proofErr w:type="gramEnd"/>
-            <w:r>
-              <w:t xml:space="preserve"> Mode</w:t>
-            </w:r>
-          </w:p>
-          <w:p/>
-          <w:p>
-            <w:r>
-              <w:t xml:space="preserve">q1 = </w:t>
-            </w:r>
-            <w:proofErr w:type="spellStart"/>
-            <w:proofErr w:type="gramStart"/>
-            <w:r>
-              <w:t>np.percentile</w:t>
-            </w:r>
-            <w:proofErr w:type="spellEnd"/>
-            <w:proofErr w:type="gramEnd"/>
-            <w:r>
-              <w:t>(ages, 25)</w:t>
-            </w:r>
-          </w:p>
-          <w:p>
-            <w:r>
-              <w:t xml:space="preserve">q3 = </w:t>
-            </w:r>
-            <w:proofErr w:type="spellStart"/>
-            <w:proofErr w:type="gramStart"/>
-            <w:r>
-              <w:t>np.percentile</w:t>
-            </w:r>
-            <w:proofErr w:type="spellEnd"/>
-            <w:proofErr w:type="gramEnd"/>
-            <w:r>
-              <w:t>(ages, 75)</w:t>
-            </w:r>
-          </w:p>
-          <w:p/>
-          <w:p>
+            <w:proofErr w:type="spellStart"/>
+            <w:r>
+              <w:t>f"Interquartile</w:t>
+            </w:r>
+            <w:proofErr w:type="spellEnd"/>
+            <w:r>
+              <w:t xml:space="preserve"> Range (IQR): {</w:t>
+            </w:r>
             <w:proofErr w:type="spellStart"/>
             <w:r>
               <w:t>iqr</w:t>
             </w:r>
             <w:proofErr w:type="spellEnd"/>
             <w:r>
-              <w:t xml:space="preserve"> = q3 - q1</w:t>
-            </w:r>
-          </w:p>
-          <w:p>
-            <w:proofErr w:type="gramStart"/>
-            <w:r>
-              <w:t>print(</w:t>
-            </w:r>
-            <w:proofErr w:type="spellStart"/>
-            <w:proofErr w:type="gramEnd"/>
-            <w:r>
-              <w:t>f"Interquartile</w:t>
-            </w:r>
-            <w:proofErr w:type="spellEnd"/>
-            <w:r>
-              <w:t xml:space="preserve"> Range (IQR): {</w:t>
-            </w:r>
-            <w:proofErr w:type="spellStart"/>
-            <w:r>
-              <w:t>iqr</w:t>
-            </w:r>
-            <w:proofErr w:type="spellEnd"/>
-            <w:r>
               <w:t>}")</w:t>
             </w:r>
           </w:p>
           <w:p>
-            <w:proofErr w:type="gramStart"/>
-            <w:r>
-              <w:t>print(</w:t>
-            </w:r>
-            <w:proofErr w:type="gramEnd"/>
-            <w:r>
-              <w:t>"Range: " + str(</w:t>
+            <w:r>
+              <w:t>print("Range: " + str(</w:t>
             </w:r>
             <w:proofErr w:type="spellStart"/>
             <w:r>
@@ -662,15 +513,7 @@
             </w:r>
             <w:proofErr w:type="spellEnd"/>
             <w:r>
-              <w:t>(ages)</w:t>
-            </w:r>
-            <w:proofErr w:type="gramStart"/>
-            <w:r>
-              <w:t>))  #</w:t>
-            </w:r>
-            <w:proofErr w:type="gramEnd"/>
-            <w:r>
-              <w:t xml:space="preserve"> Range</w:t>
+              <w:t>(ages)))  # Range</w:t>
             </w:r>
           </w:p>
           <w:p>
@@ -940,26 +783,18 @@
             </w:r>
             <w:proofErr w:type="spellStart"/>
             <w:r>
-              <w:t>sorted_</w:t>
-            </w:r>
-            <w:proofErr w:type="gramStart"/>
-            <w:r>
-              <w:t>data</w:t>
-            </w:r>
-            <w:proofErr w:type="spellEnd"/>
-            <w:r>
-              <w:t>[</w:t>
-            </w:r>
-            <w:proofErr w:type="gramEnd"/>
-            <w:r>
-              <w:t xml:space="preserve">mid - 1] + </w:t>
-            </w:r>
-            <w:proofErr w:type="spellStart"/>
-            <w:r>
               <w:t>sorted_data</w:t>
             </w:r>
             <w:proofErr w:type="spellEnd"/>
             <w:r>
+              <w:t xml:space="preserve">[mid - 1] + </w:t>
+            </w:r>
+            <w:proofErr w:type="spellStart"/>
+            <w:r>
+              <w:t>sorted_data</w:t>
+            </w:r>
+            <w:proofErr w:type="spellEnd"/>
+            <w:r>
               <w:t>[mid]) / 2</w:t>
             </w:r>
           </w:p>
@@ -1015,17 +850,12 @@
               <w:t xml:space="preserve">        frequency[value] = </w:t>
             </w:r>
             <w:proofErr w:type="spellStart"/>
-            <w:proofErr w:type="gramStart"/>
             <w:r>
               <w:t>frequency.get</w:t>
             </w:r>
             <w:proofErr w:type="spellEnd"/>
             <w:r>
-              <w:t>(</w:t>
-            </w:r>
-            <w:proofErr w:type="gramEnd"/>
-            <w:r>
-              <w:t>value, 0) + 1</w:t>
+              <w:t>(value, 0) + 1</w:t>
             </w:r>
           </w:p>
           <w:p/>
@@ -1042,12 +872,10 @@
               <w:t xml:space="preserve"> = max(</w:t>
             </w:r>
             <w:proofErr w:type="spellStart"/>
-            <w:proofErr w:type="gramStart"/>
             <w:r>
               <w:t>frequency.values</w:t>
             </w:r>
             <w:proofErr w:type="spellEnd"/>
-            <w:proofErr w:type="gramEnd"/>
             <w:r>
               <w:t>())</w:t>
             </w:r>
@@ -1065,12 +893,10 @@
               <w:t xml:space="preserve"> in </w:t>
             </w:r>
             <w:proofErr w:type="spellStart"/>
-            <w:proofErr w:type="gramStart"/>
             <w:r>
               <w:t>frequency.items</w:t>
             </w:r>
             <w:proofErr w:type="spellEnd"/>
-            <w:proofErr w:type="gramEnd"/>
             <w:r>
               <w:t xml:space="preserve">() if </w:t>
             </w:r>
@@ -1145,15 +971,7 @@
           </w:p>
           <w:p>
             <w:r>
-              <w:t xml:space="preserve">        return </w:t>
-            </w:r>
-            <w:proofErr w:type="gramStart"/>
-            <w:r>
-              <w:t>modes[</w:t>
-            </w:r>
-            <w:proofErr w:type="gramEnd"/>
-            <w:r>
-              <w:t>0]</w:t>
+              <w:t>        return modes[0]</w:t>
             </w:r>
           </w:p>
           <w:p>
@@ -1259,23 +1077,13 @@
           </w:p>
           <w:p/>
           <w:p>
-            <w:proofErr w:type="gramStart"/>
-            <w:r>
-              <w:t>print(</w:t>
-            </w:r>
-            <w:proofErr w:type="gramEnd"/>
-            <w:r>
-              <w:t>"Data:", data)</w:t>
-            </w:r>
-          </w:p>
-          <w:p>
-            <w:proofErr w:type="gramStart"/>
-            <w:r>
-              <w:t>print(</w:t>
-            </w:r>
-            <w:proofErr w:type="gramEnd"/>
-            <w:r>
-              <w:t xml:space="preserve">"Mean:", </w:t>
+            <w:r>
+              <w:t>print("Data:", data)</w:t>
+            </w:r>
+          </w:p>
+          <w:p>
+            <w:r>
+              <w:t xml:space="preserve">print("Mean:", </w:t>
             </w:r>
             <w:proofErr w:type="spellStart"/>
             <w:r>
@@ -1287,13 +1095,8 @@
             </w:r>
           </w:p>
           <w:p>
-            <w:proofErr w:type="gramStart"/>
-            <w:r>
-              <w:t>print(</w:t>
-            </w:r>
-            <w:proofErr w:type="gramEnd"/>
-            <w:r>
-              <w:t xml:space="preserve">"Median:", </w:t>
+            <w:r>
+              <w:t xml:space="preserve">print("Median:", </w:t>
             </w:r>
             <w:proofErr w:type="spellStart"/>
             <w:r>
@@ -1305,13 +1108,8 @@
             </w:r>
           </w:p>
           <w:p>
-            <w:proofErr w:type="gramStart"/>
-            <w:r>
-              <w:t>print(</w:t>
-            </w:r>
-            <w:proofErr w:type="gramEnd"/>
-            <w:r>
-              <w:t xml:space="preserve">"Mode:", </w:t>
+            <w:r>
+              <w:t xml:space="preserve">print("Mode:", </w:t>
             </w:r>
             <w:proofErr w:type="spellStart"/>
             <w:r>
@@ -1323,13 +1121,8 @@
             </w:r>
           </w:p>
           <w:p>
-            <w:proofErr w:type="gramStart"/>
-            <w:r>
-              <w:t>print(</w:t>
-            </w:r>
-            <w:proofErr w:type="gramEnd"/>
-            <w:r>
-              <w:t>"Standard Deviation:", round(</w:t>
+            <w:r>
+              <w:t>print("Standard Deviation:", round(</w:t>
             </w:r>
             <w:proofErr w:type="spellStart"/>
             <w:r>
@@ -1466,6 +1259,12 @@
         <w:rPr>
           <w:lang w:val="en-US"/>
         </w:rPr>
+        <w:t xml:space="preserve">Experiment 3: </w:t>
+      </w:r>
+      <w:r>
+        <w:rPr>
+          <w:lang w:val="en-US"/>
+        </w:rPr>
         <w:t>Probability Distributions</w:t>
       </w:r>
     </w:p>
@@ -1501,12 +1300,10 @@
               <w:t xml:space="preserve">from </w:t>
             </w:r>
             <w:proofErr w:type="spellStart"/>
-            <w:proofErr w:type="gramStart"/>
             <w:r>
               <w:t>scipy.stats</w:t>
             </w:r>
             <w:proofErr w:type="spellEnd"/>
-            <w:proofErr w:type="gramEnd"/>
             <w:r>
               <w:t xml:space="preserve"> import </w:t>
             </w:r>
@@ -1521,12 +1318,10 @@
               <w:t xml:space="preserve">import </w:t>
             </w:r>
             <w:proofErr w:type="spellStart"/>
-            <w:proofErr w:type="gramStart"/>
             <w:r>
               <w:t>matplotlib.pyplot</w:t>
             </w:r>
             <w:proofErr w:type="spellEnd"/>
-            <w:proofErr w:type="gramEnd"/>
             <w:r>
               <w:t xml:space="preserve"> as </w:t>
             </w:r>
@@ -1577,13 +1372,8 @@
               <w:t>(</w:t>
             </w:r>
             <w:proofErr w:type="spellStart"/>
-            <w:proofErr w:type="gramStart"/>
-            <w:r>
-              <w:t>r,n</w:t>
-            </w:r>
-            <w:proofErr w:type="gramEnd"/>
-            <w:r>
-              <w:t>,p</w:t>
+            <w:r>
+              <w:t>r,n,p</w:t>
             </w:r>
             <w:proofErr w:type="spellEnd"/>
             <w:r>
@@ -1601,7 +1391,6 @@
           <w:p/>
           <w:p>
             <w:proofErr w:type="spellStart"/>
-            <w:proofErr w:type="gramStart"/>
             <w:r>
               <w:t>plt.bar</w:t>
             </w:r>
@@ -1610,7 +1399,6 @@
               <w:t>(</w:t>
             </w:r>
             <w:proofErr w:type="spellStart"/>
-            <w:proofErr w:type="gramEnd"/>
             <w:r>
               <w:t>r_values</w:t>
             </w:r>
@@ -1633,12 +1421,10 @@
               <w:t xml:space="preserve">_ = </w:t>
             </w:r>
             <w:proofErr w:type="spellStart"/>
-            <w:proofErr w:type="gramStart"/>
             <w:r>
               <w:t>plt.title</w:t>
             </w:r>
             <w:proofErr w:type="spellEnd"/>
-            <w:proofErr w:type="gramEnd"/>
             <w:r>
               <w:t>(</w:t>
             </w:r>
@@ -1654,12 +1440,10 @@
           <w:p/>
           <w:p>
             <w:proofErr w:type="spellStart"/>
-            <w:proofErr w:type="gramStart"/>
             <w:r>
               <w:t>plt.show</w:t>
             </w:r>
             <w:proofErr w:type="spellEnd"/>
-            <w:proofErr w:type="gramEnd"/>
             <w:r>
               <w:t>()</w:t>
             </w:r>
@@ -1716,6 +1500,7 @@
             </w:pPr>
             <w:r>
               <w:rPr>
+                <w:noProof/>
                 <w:lang w:val="en-US"/>
               </w:rPr>
               <w:lastRenderedPageBreak/>
@@ -1805,12 +1590,10 @@
               <w:t xml:space="preserve">from </w:t>
             </w:r>
             <w:proofErr w:type="spellStart"/>
-            <w:proofErr w:type="gramStart"/>
             <w:r>
               <w:t>scipy.stats</w:t>
             </w:r>
             <w:proofErr w:type="spellEnd"/>
-            <w:proofErr w:type="gramEnd"/>
             <w:r>
               <w:t xml:space="preserve"> import </w:t>
             </w:r>
@@ -1825,12 +1608,10 @@
               <w:t xml:space="preserve">import </w:t>
             </w:r>
             <w:proofErr w:type="spellStart"/>
-            <w:proofErr w:type="gramStart"/>
             <w:r>
               <w:t>matplotlib.pyplot</w:t>
             </w:r>
             <w:proofErr w:type="spellEnd"/>
-            <w:proofErr w:type="gramEnd"/>
             <w:r>
               <w:t xml:space="preserve"> as </w:t>
             </w:r>
@@ -1864,12 +1645,10 @@
               <w:t xml:space="preserve"> = </w:t>
             </w:r>
             <w:proofErr w:type="spellStart"/>
-            <w:proofErr w:type="gramStart"/>
             <w:r>
               <w:t>np.arange</w:t>
             </w:r>
             <w:proofErr w:type="spellEnd"/>
-            <w:proofErr w:type="gramEnd"/>
             <w:r>
               <w:t>(0,15)</w:t>
             </w:r>
@@ -1885,7 +1664,6 @@
               <w:t xml:space="preserve"> = </w:t>
             </w:r>
             <w:proofErr w:type="spellStart"/>
-            <w:proofErr w:type="gramStart"/>
             <w:r>
               <w:t>poisson.pmf</w:t>
             </w:r>
@@ -1894,7 +1672,6 @@
               <w:t>(</w:t>
             </w:r>
             <w:proofErr w:type="spellStart"/>
-            <w:proofErr w:type="gramEnd"/>
             <w:r>
               <w:t>k_values</w:t>
             </w:r>
@@ -1915,15 +1692,7 @@
             </w:r>
             <w:proofErr w:type="spellStart"/>
             <w:r>
-              <w:t>k_</w:t>
-            </w:r>
-            <w:proofErr w:type="gramStart"/>
-            <w:r>
-              <w:t>values,pmf</w:t>
-            </w:r>
-            <w:proofErr w:type="gramEnd"/>
-            <w:r>
-              <w:t>_values</w:t>
+              <w:t>k_values,pmf_values</w:t>
             </w:r>
             <w:proofErr w:type="spellEnd"/>
             <w:r>
@@ -1936,38 +1705,29 @@
               <w:t xml:space="preserve">_ = </w:t>
             </w:r>
             <w:proofErr w:type="spellStart"/>
-            <w:proofErr w:type="gramStart"/>
             <w:r>
               <w:t>plt.title</w:t>
             </w:r>
             <w:proofErr w:type="spellEnd"/>
-            <w:proofErr w:type="gramEnd"/>
             <w:r>
               <w:t>(</w:t>
             </w:r>
             <w:proofErr w:type="spellStart"/>
-            <w:proofErr w:type="gramStart"/>
             <w:r>
               <w:t>f'Poisson</w:t>
             </w:r>
             <w:proofErr w:type="spellEnd"/>
             <w:r>
-              <w:t xml:space="preserve">  distribution</w:t>
-            </w:r>
-            <w:proofErr w:type="gramEnd"/>
-            <w:r>
-              <w:t>')</w:t>
+              <w:t xml:space="preserve">  distribution')</w:t>
             </w:r>
           </w:p>
           <w:p/>
           <w:p>
             <w:proofErr w:type="spellStart"/>
-            <w:proofErr w:type="gramStart"/>
             <w:r>
               <w:t>plt.show</w:t>
             </w:r>
             <w:proofErr w:type="spellEnd"/>
-            <w:proofErr w:type="gramEnd"/>
             <w:r>
               <w:t>()</w:t>
             </w:r>
@@ -2024,6 +1784,7 @@
             </w:pPr>
             <w:r>
               <w:rPr>
+                <w:noProof/>
                 <w:lang w:val="en-US"/>
               </w:rPr>
               <w:lastRenderedPageBreak/>
@@ -2067,6 +1828,315 @@
         </w:tc>
       </w:tr>
     </w:tbl>
+    <w:p>
+      <w:pPr>
+        <w:rPr>
+          <w:lang w:val="en-US"/>
+        </w:rPr>
+      </w:pPr>
+    </w:p>
+    <w:p>
+      <w:pPr>
+        <w:rPr>
+          <w:lang w:val="en-US"/>
+        </w:rPr>
+      </w:pPr>
+    </w:p>
+    <w:p>
+      <w:pPr>
+        <w:rPr>
+          <w:lang w:val="en-US"/>
+        </w:rPr>
+      </w:pPr>
+      <w:r>
+        <w:rPr>
+          <w:lang w:val="en-US"/>
+        </w:rPr>
+        <w:t>Normal</w:t>
+      </w:r>
+      <w:r>
+        <w:rPr>
+          <w:lang w:val="en-US"/>
+        </w:rPr>
+        <w:t xml:space="preserve"> Distribution</w:t>
+      </w:r>
+    </w:p>
+    <w:tbl>
+      <w:tblPr>
+        <w:tblStyle w:val="TableGrid"/>
+        <w:tblW w:w="0" w:type="auto"/>
+        <w:tblLook w:val="04A0" w:firstRow="1" w:lastRow="0" w:firstColumn="1" w:lastColumn="0" w:noHBand="0" w:noVBand="1"/>
+      </w:tblPr>
+      <w:tblGrid>
+        <w:gridCol w:w="9016"/>
+      </w:tblGrid>
+      <w:tr>
+        <w:tc>
+          <w:tcPr>
+            <w:tcW w:w="9016" w:type="dxa"/>
+          </w:tcPr>
+          <w:p>
+            <w:r>
+              <w:t xml:space="preserve">import </w:t>
+            </w:r>
+            <w:proofErr w:type="spellStart"/>
+            <w:r>
+              <w:t>numpy</w:t>
+            </w:r>
+            <w:proofErr w:type="spellEnd"/>
+            <w:r>
+              <w:t xml:space="preserve"> as np</w:t>
+            </w:r>
+          </w:p>
+          <w:p>
+            <w:r>
+              <w:t xml:space="preserve">from </w:t>
+            </w:r>
+            <w:proofErr w:type="spellStart"/>
+            <w:r>
+              <w:t>scipy.stats</w:t>
+            </w:r>
+            <w:proofErr w:type="spellEnd"/>
+            <w:r>
+              <w:t xml:space="preserve"> import norm</w:t>
+            </w:r>
+          </w:p>
+          <w:p>
+            <w:r>
+              <w:t xml:space="preserve">import </w:t>
+            </w:r>
+            <w:proofErr w:type="spellStart"/>
+            <w:r>
+              <w:t>matplotlib.pyplot</w:t>
+            </w:r>
+            <w:proofErr w:type="spellEnd"/>
+            <w:r>
+              <w:t xml:space="preserve"> as </w:t>
+            </w:r>
+            <w:proofErr w:type="spellStart"/>
+            <w:r>
+              <w:t>plt</w:t>
+            </w:r>
+            <w:proofErr w:type="spellEnd"/>
+          </w:p>
+          <w:p/>
+          <w:p>
+            <w:r>
+              <w:t>mean = 0</w:t>
+            </w:r>
+          </w:p>
+          <w:p>
+            <w:proofErr w:type="spellStart"/>
+            <w:r>
+              <w:t>std_dev</w:t>
+            </w:r>
+            <w:proofErr w:type="spellEnd"/>
+            <w:r>
+              <w:t xml:space="preserve"> = 1</w:t>
+            </w:r>
+          </w:p>
+          <w:p/>
+          <w:p>
+            <w:r>
+              <w:t xml:space="preserve">x = </w:t>
+            </w:r>
+            <w:proofErr w:type="spellStart"/>
+            <w:r>
+              <w:t>np.linspace</w:t>
+            </w:r>
+            <w:proofErr w:type="spellEnd"/>
+            <w:r>
+              <w:t>(-4,4,100)</w:t>
+            </w:r>
+          </w:p>
+          <w:p/>
+          <w:p>
+            <w:r>
+              <w:t>print(x)</w:t>
+            </w:r>
+          </w:p>
+          <w:p>
+            <w:r>
+              <w:t>y = norm.pdf(</w:t>
+            </w:r>
+            <w:proofErr w:type="spellStart"/>
+            <w:r>
+              <w:t>x,mean</w:t>
+            </w:r>
+            <w:proofErr w:type="spellEnd"/>
+            <w:r>
+              <w:t xml:space="preserve">, </w:t>
+            </w:r>
+            <w:proofErr w:type="spellStart"/>
+            <w:r>
+              <w:t>std_dev</w:t>
+            </w:r>
+            <w:proofErr w:type="spellEnd"/>
+            <w:r>
+              <w:t>)</w:t>
+            </w:r>
+          </w:p>
+          <w:p/>
+          <w:p>
+            <w:proofErr w:type="spellStart"/>
+            <w:r>
+              <w:t>plt.plot</w:t>
+            </w:r>
+            <w:proofErr w:type="spellEnd"/>
+            <w:r>
+              <w:t>(</w:t>
+            </w:r>
+            <w:proofErr w:type="spellStart"/>
+            <w:r>
+              <w:t>x,y</w:t>
+            </w:r>
+            <w:proofErr w:type="spellEnd"/>
+            <w:r>
+              <w:t>)</w:t>
+            </w:r>
+          </w:p>
+          <w:p>
+            <w:proofErr w:type="spellStart"/>
+            <w:r>
+              <w:t>plt.title</w:t>
+            </w:r>
+            <w:proofErr w:type="spellEnd"/>
+            <w:r>
+              <w:t>("Normal Distribution( Mean = 0, SD = 1)")</w:t>
+            </w:r>
+          </w:p>
+          <w:p>
+            <w:proofErr w:type="spellStart"/>
+            <w:r>
+              <w:t>plt.xlabel</w:t>
+            </w:r>
+            <w:proofErr w:type="spellEnd"/>
+            <w:r>
+              <w:t>("X Values")</w:t>
+            </w:r>
+          </w:p>
+          <w:p>
+            <w:proofErr w:type="spellStart"/>
+            <w:r>
+              <w:t>plt.ylabel</w:t>
+            </w:r>
+            <w:proofErr w:type="spellEnd"/>
+            <w:r>
+              <w:t>("Probability Density")</w:t>
+            </w:r>
+          </w:p>
+          <w:p>
+            <w:proofErr w:type="spellStart"/>
+            <w:r>
+              <w:t>plt.show</w:t>
+            </w:r>
+            <w:proofErr w:type="spellEnd"/>
+            <w:r>
+              <w:t>()</w:t>
+            </w:r>
+          </w:p>
+          <w:p>
+            <w:pPr>
+              <w:rPr>
+                <w:lang w:val="en-US"/>
+              </w:rPr>
+            </w:pPr>
+          </w:p>
+        </w:tc>
+      </w:tr>
+    </w:tbl>
+    <w:p>
+      <w:pPr>
+        <w:rPr>
+          <w:lang w:val="en-US"/>
+        </w:rPr>
+      </w:pPr>
+    </w:p>
+    <w:p>
+      <w:pPr>
+        <w:rPr>
+          <w:lang w:val="en-US"/>
+        </w:rPr>
+      </w:pPr>
+      <w:r>
+        <w:rPr>
+          <w:lang w:val="en-US"/>
+        </w:rPr>
+        <w:t>Output</w:t>
+      </w:r>
+    </w:p>
+    <w:tbl>
+      <w:tblPr>
+        <w:tblStyle w:val="TableGrid"/>
+        <w:tblW w:w="0" w:type="auto"/>
+        <w:tblLook w:val="04A0" w:firstRow="1" w:lastRow="0" w:firstColumn="1" w:lastColumn="0" w:noHBand="0" w:noVBand="1"/>
+      </w:tblPr>
+      <w:tblGrid>
+        <w:gridCol w:w="9016"/>
+      </w:tblGrid>
+      <w:tr>
+        <w:tc>
+          <w:tcPr>
+            <w:tcW w:w="9016" w:type="dxa"/>
+          </w:tcPr>
+          <w:p>
+            <w:pPr>
+              <w:rPr>
+                <w:lang w:val="en-US"/>
+              </w:rPr>
+            </w:pPr>
+            <w:r>
+              <w:rPr>
+                <w:lang w:val="en-US"/>
+              </w:rPr>
+              <w:lastRenderedPageBreak/>
+              <w:drawing>
+                <wp:inline distT="0" distB="0" distL="0" distR="0" wp14:anchorId="390009F9" wp14:editId="518B54EC">
+                  <wp:extent cx="5731510" cy="4893310"/>
+                  <wp:effectExtent l="0" t="0" r="2540" b="2540"/>
+                  <wp:docPr id="1542435894" name="Picture 1"/>
+                  <wp:cNvGraphicFramePr>
+                    <a:graphicFrameLocks xmlns:a="http://schemas.openxmlformats.org/drawingml/2006/main" noChangeAspect="1"/>
+                  </wp:cNvGraphicFramePr>
+                  <a:graphic xmlns:a="http://schemas.openxmlformats.org/drawingml/2006/main">
+                    <a:graphicData uri="http://schemas.openxmlformats.org/drawingml/2006/picture">
+                      <pic:pic xmlns:pic="http://schemas.openxmlformats.org/drawingml/2006/picture">
+                        <pic:nvPicPr>
+                          <pic:cNvPr id="1542435894" name=""/>
+                          <pic:cNvPicPr/>
+                        </pic:nvPicPr>
+                        <pic:blipFill>
+                          <a:blip r:embed="rId8"/>
+                          <a:stretch>
+                            <a:fillRect/>
+                          </a:stretch>
+                        </pic:blipFill>
+                        <pic:spPr>
+                          <a:xfrm>
+                            <a:off x="0" y="0"/>
+                            <a:ext cx="5731510" cy="4893310"/>
+                          </a:xfrm>
+                          <a:prstGeom prst="rect">
+                            <a:avLst/>
+                          </a:prstGeom>
+                        </pic:spPr>
+                      </pic:pic>
+                    </a:graphicData>
+                  </a:graphic>
+                </wp:inline>
+              </w:drawing>
+            </w:r>
+          </w:p>
+        </w:tc>
+      </w:tr>
+    </w:tbl>
+    <w:p>
+      <w:pPr>
+        <w:rPr>
+          <w:lang w:val="en-US"/>
+        </w:rPr>
+      </w:pPr>
+    </w:p>
     <w:p>
       <w:pPr>
         <w:rPr>

</xml_diff>